<commit_message>
cours node js word
</commit_message>
<xml_diff>
--- a/Cours_Node_Express.docx
+++ b/Cours_Node_Express.docx
@@ -4,7 +4,7 @@
   <w:body>
     <w:p>
       <w:pPr>
-        <w:pStyle w:val="Titre1"/>
+        <w:pStyle w:val="Heading1"/>
       </w:pPr>
       <w:r>
         <w:t>#</w:t>
@@ -120,7 +120,7 @@
     <w:p/>
     <w:p>
       <w:pPr>
-        <w:pStyle w:val="Titre2"/>
+        <w:pStyle w:val="Heading2"/>
       </w:pPr>
       <w:r>
         <w:t>##</w:t>
@@ -131,7 +131,7 @@
     </w:p>
     <w:p>
       <w:pPr>
-        <w:pStyle w:val="Titre3"/>
+        <w:pStyle w:val="Heading3"/>
       </w:pPr>
       <w:r>
         <w:t xml:space="preserve">### </w:t>
@@ -147,7 +147,7 @@
     </w:p>
     <w:p>
       <w:pPr>
-        <w:pStyle w:val="Titre4"/>
+        <w:pStyle w:val="Heading4"/>
       </w:pPr>
       <w:r>
         <w:t>#### Les requêtes</w:t>
@@ -180,7 +180,7 @@
     </w:p>
     <w:p>
       <w:pPr>
-        <w:pStyle w:val="Paragraphedeliste"/>
+        <w:pStyle w:val="ListParagraph"/>
         <w:numPr>
           <w:ilvl w:val="0"/>
           <w:numId w:val="1"/>
@@ -220,7 +220,7 @@
     </w:p>
     <w:p>
       <w:pPr>
-        <w:pStyle w:val="Paragraphedeliste"/>
+        <w:pStyle w:val="ListParagraph"/>
         <w:numPr>
           <w:ilvl w:val="1"/>
           <w:numId w:val="1"/>
@@ -242,7 +242,7 @@
     </w:p>
     <w:p>
       <w:pPr>
-        <w:pStyle w:val="Paragraphedeliste"/>
+        <w:pStyle w:val="ListParagraph"/>
         <w:numPr>
           <w:ilvl w:val="1"/>
           <w:numId w:val="1"/>
@@ -272,7 +272,7 @@
     </w:p>
     <w:p>
       <w:pPr>
-        <w:pStyle w:val="Paragraphedeliste"/>
+        <w:pStyle w:val="ListParagraph"/>
         <w:numPr>
           <w:ilvl w:val="1"/>
           <w:numId w:val="1"/>
@@ -291,7 +291,7 @@
     </w:p>
     <w:p>
       <w:pPr>
-        <w:pStyle w:val="Paragraphedeliste"/>
+        <w:pStyle w:val="ListParagraph"/>
         <w:numPr>
           <w:ilvl w:val="1"/>
           <w:numId w:val="1"/>
@@ -313,7 +313,7 @@
     </w:p>
     <w:p>
       <w:pPr>
-        <w:pStyle w:val="Paragraphedeliste"/>
+        <w:pStyle w:val="ListParagraph"/>
         <w:numPr>
           <w:ilvl w:val="1"/>
           <w:numId w:val="1"/>
@@ -332,13 +332,13 @@
     </w:p>
     <w:p>
       <w:pPr>
-        <w:pStyle w:val="Paragraphedeliste"/>
+        <w:pStyle w:val="ListParagraph"/>
         <w:ind w:left="1440"/>
       </w:pPr>
     </w:p>
     <w:p>
       <w:pPr>
-        <w:pStyle w:val="Paragraphedeliste"/>
+        <w:pStyle w:val="ListParagraph"/>
         <w:numPr>
           <w:ilvl w:val="0"/>
           <w:numId w:val="1"/>
@@ -357,7 +357,7 @@
     </w:p>
     <w:p>
       <w:pPr>
-        <w:pStyle w:val="Paragraphedeliste"/>
+        <w:pStyle w:val="ListParagraph"/>
         <w:numPr>
           <w:ilvl w:val="1"/>
           <w:numId w:val="1"/>
@@ -379,7 +379,7 @@
     </w:p>
     <w:p>
       <w:pPr>
-        <w:pStyle w:val="Paragraphedeliste"/>
+        <w:pStyle w:val="ListParagraph"/>
         <w:ind w:firstLine="696"/>
       </w:pPr>
       <w:r>
@@ -404,7 +404,7 @@
     </w:p>
     <w:p>
       <w:pPr>
-        <w:pStyle w:val="Paragraphedeliste"/>
+        <w:pStyle w:val="ListParagraph"/>
         <w:numPr>
           <w:ilvl w:val="1"/>
           <w:numId w:val="1"/>
@@ -443,7 +443,7 @@
     </w:p>
     <w:p>
       <w:pPr>
-        <w:pStyle w:val="Paragraphedeliste"/>
+        <w:pStyle w:val="ListParagraph"/>
         <w:ind w:left="1440"/>
       </w:pPr>
       <w:r>
@@ -460,7 +460,7 @@
     </w:p>
     <w:p>
       <w:pPr>
-        <w:pStyle w:val="Paragraphedeliste"/>
+        <w:pStyle w:val="ListParagraph"/>
         <w:numPr>
           <w:ilvl w:val="1"/>
           <w:numId w:val="1"/>
@@ -499,7 +499,7 @@
     </w:p>
     <w:p>
       <w:pPr>
-        <w:pStyle w:val="Paragraphedeliste"/>
+        <w:pStyle w:val="ListParagraph"/>
         <w:ind w:left="1440"/>
       </w:pPr>
       <w:r>
@@ -535,7 +535,7 @@
     </w:p>
     <w:p>
       <w:pPr>
-        <w:pStyle w:val="Paragraphedeliste"/>
+        <w:pStyle w:val="ListParagraph"/>
         <w:numPr>
           <w:ilvl w:val="0"/>
           <w:numId w:val="1"/>
@@ -584,7 +584,7 @@
     </w:p>
     <w:p>
       <w:pPr>
-        <w:pStyle w:val="Paragraphedeliste"/>
+        <w:pStyle w:val="ListParagraph"/>
         <w:numPr>
           <w:ilvl w:val="0"/>
           <w:numId w:val="1"/>
@@ -650,7 +650,7 @@
     </w:p>
     <w:p>
       <w:pPr>
-        <w:pStyle w:val="Paragraphedeliste"/>
+        <w:pStyle w:val="ListParagraph"/>
         <w:numPr>
           <w:ilvl w:val="0"/>
           <w:numId w:val="24"/>
@@ -662,7 +662,7 @@
       <w:hyperlink r:id="rId5" w:history="1">
         <w:r>
           <w:rPr>
-            <w:rStyle w:val="Lienhypertexte"/>
+            <w:rStyle w:val="Hyperlink"/>
           </w:rPr>
           <w:t>http://localhost:3000/api/produits\</w:t>
         </w:r>
@@ -681,7 +681,7 @@
     </w:p>
     <w:p>
       <w:pPr>
-        <w:pStyle w:val="Paragraphedeliste"/>
+        <w:pStyle w:val="ListParagraph"/>
       </w:pPr>
       <w:r>
         <w:t>= Récupérer tous les produits</w:t>
@@ -689,7 +689,7 @@
     </w:p>
     <w:p>
       <w:pPr>
-        <w:pStyle w:val="Paragraphedeliste"/>
+        <w:pStyle w:val="ListParagraph"/>
         <w:numPr>
           <w:ilvl w:val="0"/>
           <w:numId w:val="24"/>
@@ -701,7 +701,7 @@
       <w:hyperlink r:id="rId6" w:history="1">
         <w:r>
           <w:rPr>
-            <w:rStyle w:val="Lienhypertexte"/>
+            <w:rStyle w:val="Hyperlink"/>
           </w:rPr>
           <w:t>http://localhost:3000/api/produits/42\</w:t>
         </w:r>
@@ -720,7 +720,7 @@
     </w:p>
     <w:p>
       <w:pPr>
-        <w:pStyle w:val="Paragraphedeliste"/>
+        <w:pStyle w:val="ListParagraph"/>
       </w:pPr>
       <w:r>
         <w:t xml:space="preserve">= Récupérer le produit dont </w:t>
@@ -736,7 +736,7 @@
     </w:p>
     <w:p>
       <w:pPr>
-        <w:pStyle w:val="Paragraphedeliste"/>
+        <w:pStyle w:val="ListParagraph"/>
         <w:numPr>
           <w:ilvl w:val="0"/>
           <w:numId w:val="24"/>
@@ -748,7 +748,7 @@
       <w:hyperlink r:id="rId7" w:history="1">
         <w:r>
           <w:rPr>
-            <w:rStyle w:val="Lienhypertexte"/>
+            <w:rStyle w:val="Hyperlink"/>
           </w:rPr>
           <w:t>http://localhost:3000/api/produits?offset=10&amp;limit=30\</w:t>
         </w:r>
@@ -772,7 +772,7 @@
     </w:p>
     <w:p>
       <w:pPr>
-        <w:pStyle w:val="Paragraphedeliste"/>
+        <w:pStyle w:val="ListParagraph"/>
       </w:pPr>
       <w:r>
         <w:t>=</w:t>
@@ -805,7 +805,7 @@
     </w:p>
     <w:p>
       <w:pPr>
-        <w:pStyle w:val="Paragraphedeliste"/>
+        <w:pStyle w:val="ListParagraph"/>
       </w:pPr>
       <w:r>
         <w:t xml:space="preserve">offset et </w:t>
@@ -827,7 +827,7 @@
     </w:p>
     <w:p>
       <w:pPr>
-        <w:pStyle w:val="Paragraphedeliste"/>
+        <w:pStyle w:val="ListParagraph"/>
         <w:numPr>
           <w:ilvl w:val="0"/>
           <w:numId w:val="24"/>
@@ -839,7 +839,7 @@
       <w:hyperlink r:id="rId8" w:history="1">
         <w:r>
           <w:rPr>
-            <w:rStyle w:val="Lienhypertexte"/>
+            <w:rStyle w:val="Hyperlink"/>
           </w:rPr>
           <w:t>http://localhost:3000/api/produits\</w:t>
         </w:r>
@@ -881,7 +881,7 @@
     </w:p>
     <w:p>
       <w:pPr>
-        <w:pStyle w:val="Paragraphedeliste"/>
+        <w:pStyle w:val="ListParagraph"/>
         <w:numPr>
           <w:ilvl w:val="0"/>
           <w:numId w:val="24"/>
@@ -893,7 +893,7 @@
       <w:hyperlink r:id="rId9" w:history="1">
         <w:r>
           <w:rPr>
-            <w:rStyle w:val="Lienhypertexte"/>
+            <w:rStyle w:val="Hyperlink"/>
           </w:rPr>
           <w:t>http://localhost:3000/api/produits/42\</w:t>
         </w:r>
@@ -943,7 +943,7 @@
     </w:p>
     <w:p>
       <w:pPr>
-        <w:pStyle w:val="Paragraphedeliste"/>
+        <w:pStyle w:val="ListParagraph"/>
         <w:numPr>
           <w:ilvl w:val="0"/>
           <w:numId w:val="24"/>
@@ -955,7 +955,7 @@
       <w:hyperlink r:id="rId10" w:history="1">
         <w:r>
           <w:rPr>
-            <w:rStyle w:val="Lienhypertexte"/>
+            <w:rStyle w:val="Hyperlink"/>
           </w:rPr>
           <w:t>http://localhost:3000/api/produits/42\</w:t>
         </w:r>
@@ -987,7 +987,7 @@
     <w:p/>
     <w:p>
       <w:pPr>
-        <w:pStyle w:val="Titre4"/>
+        <w:pStyle w:val="Heading4"/>
       </w:pPr>
       <w:r>
         <w:t>#### Les réponses</w:t>
@@ -1162,7 +1162,7 @@
     <w:p/>
     <w:p>
       <w:pPr>
-        <w:pStyle w:val="Titre3"/>
+        <w:pStyle w:val="Heading3"/>
       </w:pPr>
       <w:r>
         <w:t>### Principes d'API REST :</w:t>
@@ -1324,7 +1324,7 @@
       <w:hyperlink r:id="rId11" w:history="1">
         <w:r>
           <w:rPr>
-            <w:rStyle w:val="Lienhypertexte"/>
+            <w:rStyle w:val="Hyperlink"/>
           </w:rPr>
           <w:t>http://localhost:3000/api/42/tasks</w:t>
         </w:r>
@@ -1343,7 +1343,7 @@
       <w:hyperlink r:id="rId12" w:history="1">
         <w:r>
           <w:rPr>
-            <w:rStyle w:val="Lienhypertexte"/>
+            <w:rStyle w:val="Hyperlink"/>
           </w:rPr>
           <w:t>http://localhost:3000/api/tasks/next</w:t>
         </w:r>
@@ -1362,7 +1362,7 @@
       <w:hyperlink r:id="rId13" w:history="1">
         <w:r>
           <w:rPr>
-            <w:rStyle w:val="Lienhypertexte"/>
+            <w:rStyle w:val="Hyperlink"/>
           </w:rPr>
           <w:t>http://localhost:3000/api/tasks?category=2&amp;category=3</w:t>
         </w:r>
@@ -1400,7 +1400,7 @@
     <w:p/>
     <w:p>
       <w:pPr>
-        <w:pStyle w:val="Titre2"/>
+        <w:pStyle w:val="Heading2"/>
       </w:pPr>
       <w:r>
         <w:t>## Initialiser un projet Node</w:t>
@@ -1408,7 +1408,7 @@
     </w:p>
     <w:p>
       <w:pPr>
-        <w:pStyle w:val="Titre3"/>
+        <w:pStyle w:val="Heading3"/>
       </w:pPr>
       <w:r>
         <w:t>### Télécharger Node hihi no shit</w:t>
@@ -1418,7 +1418,7 @@
       <w:hyperlink r:id="rId14" w:history="1">
         <w:r>
           <w:rPr>
-            <w:rStyle w:val="Lienhypertexte"/>
+            <w:rStyle w:val="Hyperlink"/>
           </w:rPr>
           <w:t>http://nodejs.org/fr</w:t>
         </w:r>
@@ -1440,7 +1440,7 @@
     </w:p>
     <w:p>
       <w:pPr>
-        <w:pStyle w:val="Titre3"/>
+        <w:pStyle w:val="Heading3"/>
       </w:pPr>
       <w:r>
         <w:lastRenderedPageBreak/>
@@ -1674,7 +1674,7 @@
     </w:p>
     <w:p>
       <w:pPr>
-        <w:pStyle w:val="Paragraphedeliste"/>
+        <w:pStyle w:val="ListParagraph"/>
         <w:numPr>
           <w:ilvl w:val="0"/>
           <w:numId w:val="5"/>
@@ -1702,7 +1702,7 @@
     <w:p/>
     <w:p>
       <w:pPr>
-        <w:pStyle w:val="Titre3"/>
+        <w:pStyle w:val="Heading3"/>
       </w:pPr>
       <w:r>
         <w:t>### Créer le fichier app.js</w:t>
@@ -1728,6 +1728,9 @@
     </w:p>
     <w:p>
       <w:r>
+        <w:rPr>
+          <w:noProof/>
+        </w:rPr>
         <w:drawing>
           <wp:inline distT="0" distB="0" distL="0" distR="0" wp14:anchorId="053AC46D" wp14:editId="3A8E338F">
             <wp:extent cx="3343742" cy="1057423"/>
@@ -1768,7 +1771,7 @@
     <w:p/>
     <w:p>
       <w:pPr>
-        <w:pStyle w:val="Titre2"/>
+        <w:pStyle w:val="Heading2"/>
       </w:pPr>
       <w:r>
         <w:t>## Installer Express dans le projet :</w:t>
@@ -1889,7 +1892,7 @@
     </w:p>
     <w:p>
       <w:pPr>
-        <w:pStyle w:val="Paragraphedeliste"/>
+        <w:pStyle w:val="ListParagraph"/>
         <w:numPr>
           <w:ilvl w:val="0"/>
           <w:numId w:val="5"/>
@@ -1918,7 +1921,7 @@
     <w:p/>
     <w:p>
       <w:pPr>
-        <w:pStyle w:val="Titre3"/>
+        <w:pStyle w:val="Heading3"/>
       </w:pPr>
       <w:r>
         <w:t>### Bonus : Récupérer un projet Node/Express :</w:t>
@@ -1984,7 +1987,7 @@
     </w:p>
     <w:p>
       <w:pPr>
-        <w:pStyle w:val="Titre3"/>
+        <w:pStyle w:val="Heading3"/>
       </w:pPr>
       <w:r>
         <w:t>### Création d'un serveur Web avec Express :</w:t>
@@ -1997,6 +2000,9 @@
     </w:p>
     <w:p>
       <w:r>
+        <w:rPr>
+          <w:noProof/>
+        </w:rPr>
         <w:drawing>
           <wp:inline distT="0" distB="0" distL="0" distR="0" wp14:anchorId="2060B253" wp14:editId="17EC0DEC">
             <wp:extent cx="3941080" cy="3101340"/>
@@ -2036,7 +2042,7 @@
     </w:p>
     <w:p>
       <w:pPr>
-        <w:pStyle w:val="Titre3"/>
+        <w:pStyle w:val="Heading3"/>
       </w:pPr>
       <w:r>
         <w:lastRenderedPageBreak/>
@@ -2053,7 +2059,17 @@
       </w:r>
       <w:proofErr w:type="spellEnd"/>
       <w:r>
-        <w:t xml:space="preserve"> il faut le couper avec **ctrl + c** et le relancer avec </w:t>
+        <w:t xml:space="preserve"> il faut le couper avec </w:t>
+      </w:r>
+      <w:r>
+        <w:rPr>
+          <w:b/>
+          <w:bCs/>
+        </w:rPr>
+        <w:t>ctrl + c</w:t>
+      </w:r>
+      <w:r>
+        <w:t xml:space="preserve"> et le relancer avec </w:t>
       </w:r>
       <w:proofErr w:type="spellStart"/>
       <w:r>
@@ -2077,7 +2093,7 @@
     </w:p>
     <w:p>
       <w:pPr>
-        <w:pStyle w:val="Titre4"/>
+        <w:pStyle w:val="Heading4"/>
       </w:pPr>
       <w:r>
         <w:t>###</w:t>
@@ -2190,6 +2206,9 @@
     </w:p>
     <w:p>
       <w:r>
+        <w:rPr>
+          <w:noProof/>
+        </w:rPr>
         <w:drawing>
           <wp:inline distT="0" distB="0" distL="0" distR="0" wp14:anchorId="08E64945" wp14:editId="05958FFF">
             <wp:extent cx="3486637" cy="1257475"/>
@@ -2229,7 +2248,7 @@
     </w:p>
     <w:p>
       <w:pPr>
-        <w:pStyle w:val="Titre4"/>
+        <w:pStyle w:val="Heading4"/>
       </w:pPr>
       <w:r>
         <w:t>#### Méthode 2 : Watch natif de Node depuis la version 18+</w:t>
@@ -2251,6 +2270,7 @@
     <w:p>
       <w:r>
         <w:rPr>
+          <w:noProof/>
           <w:lang w:val="en-GB"/>
         </w:rPr>
         <w:drawing>
@@ -2327,7 +2347,7 @@
     <w:p/>
     <w:p>
       <w:pPr>
-        <w:pStyle w:val="Titre3"/>
+        <w:pStyle w:val="Heading3"/>
       </w:pPr>
       <w:r>
         <w:lastRenderedPageBreak/>
@@ -2386,6 +2406,9 @@
     </w:p>
     <w:p>
       <w:r>
+        <w:rPr>
+          <w:noProof/>
+        </w:rPr>
         <w:drawing>
           <wp:inline distT="0" distB="0" distL="0" distR="0" wp14:anchorId="6D2380C7" wp14:editId="0F9F67DF">
             <wp:extent cx="2026920" cy="438662"/>
@@ -2575,6 +2598,9 @@
     </w:p>
     <w:p>
       <w:r>
+        <w:rPr>
+          <w:noProof/>
+        </w:rPr>
         <w:drawing>
           <wp:inline distT="0" distB="0" distL="0" distR="0" wp14:anchorId="65625257" wp14:editId="6A0BFBFE">
             <wp:extent cx="4526280" cy="1033256"/>
@@ -2615,7 +2641,7 @@
     <w:p/>
     <w:p>
       <w:pPr>
-        <w:pStyle w:val="Titre3"/>
+        <w:pStyle w:val="Heading3"/>
       </w:pPr>
       <w:r>
         <w:t>### Architecture du projet :</w:t>
@@ -2976,7 +3002,7 @@
     <w:p/>
     <w:p>
       <w:pPr>
-        <w:pStyle w:val="Titre3"/>
+        <w:pStyle w:val="Heading3"/>
       </w:pPr>
       <w:r>
         <w:t>### Définition des routes :</w:t>
@@ -2984,7 +3010,7 @@
     </w:p>
     <w:p>
       <w:pPr>
-        <w:pStyle w:val="Titre4"/>
+        <w:pStyle w:val="Heading4"/>
       </w:pPr>
       <w:r>
         <w:t>###</w:t>
@@ -3043,6 +3069,9 @@
     </w:p>
     <w:p>
       <w:r>
+        <w:rPr>
+          <w:noProof/>
+        </w:rPr>
         <w:drawing>
           <wp:inline distT="0" distB="0" distL="0" distR="0" wp14:anchorId="218D8BE5" wp14:editId="6AAB035A">
             <wp:extent cx="4945380" cy="1500731"/>
@@ -3095,6 +3124,9 @@
     </w:p>
     <w:p>
       <w:r>
+        <w:rPr>
+          <w:noProof/>
+        </w:rPr>
         <w:drawing>
           <wp:inline distT="0" distB="0" distL="0" distR="0" wp14:anchorId="1522B41B" wp14:editId="6F643F61">
             <wp:extent cx="3505689" cy="657317"/>
@@ -3135,7 +3167,7 @@
     <w:p/>
     <w:p>
       <w:pPr>
-        <w:pStyle w:val="Titre4"/>
+        <w:pStyle w:val="Heading4"/>
       </w:pPr>
       <w:r>
         <w:lastRenderedPageBreak/>
@@ -3196,11 +3228,21 @@
           <w:i/>
           <w:iCs/>
         </w:rPr>
-        <w:t>exemple avec task.router.js :</w:t>
-      </w:r>
-    </w:p>
-    <w:p>
-      <w:r>
+        <w:t>E</w:t>
+      </w:r>
+      <w:r>
+        <w:rPr>
+          <w:i/>
+          <w:iCs/>
+        </w:rPr>
+        <w:t>xemple avec task.router.js :</w:t>
+      </w:r>
+    </w:p>
+    <w:p>
+      <w:r>
+        <w:rPr>
+          <w:noProof/>
+        </w:rPr>
         <w:drawing>
           <wp:inline distT="0" distB="0" distL="0" distR="0" wp14:anchorId="4AEAA8FB" wp14:editId="79CA0B60">
             <wp:extent cx="5760720" cy="3709670"/>
@@ -3240,6 +3282,9 @@
     </w:p>
     <w:p>
       <w:r>
+        <w:rPr>
+          <w:noProof/>
+        </w:rPr>
         <w:drawing>
           <wp:anchor distT="0" distB="0" distL="114300" distR="114300" simplePos="0" relativeHeight="251658240" behindDoc="0" locked="0" layoutInCell="1" allowOverlap="1" wp14:anchorId="1F12A305" wp14:editId="35016863">
             <wp:simplePos x="0" y="0"/>
@@ -3355,7 +3400,7 @@
       <w:hyperlink r:id="rId25" w:anchor="logiciels-test-api" w:history="1">
         <w:r>
           <w:rPr>
-            <w:rStyle w:val="Lienhypertexte"/>
+            <w:rStyle w:val="Hyperlink"/>
           </w:rPr>
           <w:t>logiciels de test d'API</w:t>
         </w:r>
@@ -3367,7 +3412,7 @@
     <w:p/>
     <w:p>
       <w:pPr>
-        <w:pStyle w:val="Titre4"/>
+        <w:pStyle w:val="Heading4"/>
       </w:pPr>
       <w:r>
         <w:t>#### Autre manière d'écrire les routes :</w:t>
@@ -3407,6 +3452,9 @@
         </w:rPr>
       </w:pPr>
       <w:r>
+        <w:rPr>
+          <w:noProof/>
+        </w:rPr>
         <w:lastRenderedPageBreak/>
         <w:drawing>
           <wp:inline distT="0" distB="0" distL="0" distR="0" wp14:anchorId="3433974B" wp14:editId="53F7A04F">
@@ -3454,7 +3502,7 @@
     </w:p>
     <w:p>
       <w:pPr>
-        <w:pStyle w:val="Titre3"/>
+        <w:pStyle w:val="Heading3"/>
       </w:pPr>
       <w:r>
         <w:t xml:space="preserve">### Les </w:t>
@@ -3478,15 +3526,7 @@
       </w:r>
       <w:proofErr w:type="spellEnd"/>
       <w:r>
-        <w:t xml:space="preserve"> </w:t>
-      </w:r>
-      <w:proofErr w:type="spellStart"/>
-      <w:r>
-        <w:t>ssont</w:t>
-      </w:r>
-      <w:proofErr w:type="spellEnd"/>
-      <w:r>
-        <w:t xml:space="preserve"> les endroits où on va gérer la requêtes (ce qui entre en </w:t>
+        <w:t xml:space="preserve"> sont les endroits où on va gérer la requêtes (ce qui entre en </w:t>
       </w:r>
       <w:proofErr w:type="spellStart"/>
       <w:r>
@@ -3595,6 +3635,9 @@
     </w:p>
     <w:p>
       <w:r>
+        <w:rPr>
+          <w:noProof/>
+        </w:rPr>
         <w:drawing>
           <wp:inline distT="0" distB="0" distL="0" distR="0" wp14:anchorId="2F47986D" wp14:editId="4CD9C829">
             <wp:extent cx="3208866" cy="1502022"/>
@@ -3659,6 +3702,9 @@
     </w:p>
     <w:p>
       <w:r>
+        <w:rPr>
+          <w:noProof/>
+        </w:rPr>
         <w:drawing>
           <wp:inline distT="0" distB="0" distL="0" distR="0" wp14:anchorId="44204CB3" wp14:editId="7EACC993">
             <wp:extent cx="5760720" cy="2952115"/>
@@ -3748,6 +3794,9 @@
     </w:p>
     <w:p>
       <w:r>
+        <w:rPr>
+          <w:noProof/>
+        </w:rPr>
         <w:drawing>
           <wp:inline distT="0" distB="0" distL="0" distR="0" wp14:anchorId="168706BB" wp14:editId="2BCDB83B">
             <wp:extent cx="5760720" cy="3435350"/>
@@ -3836,6 +3885,7 @@
     <w:p>
       <w:r>
         <w:rPr>
+          <w:noProof/>
           <w:lang w:val="en-GB"/>
         </w:rPr>
         <w:drawing>
@@ -4017,7 +4067,7 @@
     <w:p/>
     <w:p>
       <w:pPr>
-        <w:pStyle w:val="Titre3"/>
+        <w:pStyle w:val="Heading3"/>
       </w:pPr>
       <w:r>
         <w:t>### Les Services :</w:t>
@@ -4147,7 +4197,7 @@
       <w:hyperlink r:id="rId31" w:anchor="connecter-son-api-%C3%A0-une-db" w:history="1">
         <w:r>
           <w:rPr>
-            <w:rStyle w:val="Lienhypertexte"/>
+            <w:rStyle w:val="Hyperlink"/>
           </w:rPr>
           <w:t>se connecter à une base de données</w:t>
         </w:r>
@@ -4195,18 +4245,16 @@
       <w:r>
         <w:t>Certaines données devront être cryptées dans la DB, notamment les mots de passe, pour qu'elles ne soient pas lisibles à l'</w:t>
       </w:r>
-      <w:proofErr w:type="spellStart"/>
-      <w:r>
-        <w:t>oeil</w:t>
-      </w:r>
-      <w:proofErr w:type="spellEnd"/>
-      <w:r>
-        <w:t xml:space="preserve"> nu. </w:t>
+      <w:r>
+        <w:t xml:space="preserve">œil </w:t>
+      </w:r>
+      <w:r>
+        <w:t>nu. </w:t>
       </w:r>
       <w:hyperlink r:id="rId32" w:anchor="hasher-des-donn%C3%A9es" w:history="1">
         <w:r>
           <w:rPr>
-            <w:rStyle w:val="Lienhypertexte"/>
+            <w:rStyle w:val="Hyperlink"/>
           </w:rPr>
           <w:t>Nous le ferons dans les services</w:t>
         </w:r>
@@ -4280,7 +4328,7 @@
     <w:p/>
     <w:p>
       <w:pPr>
-        <w:pStyle w:val="Titre3"/>
+        <w:pStyle w:val="Heading3"/>
       </w:pPr>
       <w:r>
         <w:t>### Les middlewares :</w:t>
@@ -4398,7 +4446,7 @@
       <w:hyperlink r:id="rId33" w:history="1">
         <w:r>
           <w:rPr>
-            <w:rStyle w:val="Lienhypertexte"/>
+            <w:rStyle w:val="Hyperlink"/>
           </w:rPr>
           <w:t>Multer</w:t>
         </w:r>
@@ -4536,7 +4584,7 @@
     <w:p/>
     <w:p>
       <w:pPr>
-        <w:pStyle w:val="Titre2"/>
+        <w:pStyle w:val="Heading2"/>
       </w:pPr>
       <w:r>
         <w:t>## Logiciels test API :</w:t>
@@ -4554,7 +4602,7 @@
       <w:hyperlink r:id="rId34" w:history="1">
         <w:r>
           <w:rPr>
-            <w:rStyle w:val="Lienhypertexte"/>
+            <w:rStyle w:val="Hyperlink"/>
           </w:rPr>
           <w:t>https://www.postman.com/downloads/</w:t>
         </w:r>
@@ -4578,7 +4626,7 @@
       <w:hyperlink r:id="rId35" w:history="1">
         <w:r>
           <w:rPr>
-            <w:rStyle w:val="Lienhypertexte"/>
+            <w:rStyle w:val="Hyperlink"/>
           </w:rPr>
           <w:t>https://insomnia.rest/</w:t>
         </w:r>
@@ -4594,7 +4642,7 @@
       <w:hyperlink r:id="rId36" w:history="1">
         <w:r>
           <w:rPr>
-            <w:rStyle w:val="Lienhypertexte"/>
+            <w:rStyle w:val="Hyperlink"/>
           </w:rPr>
           <w:t>https://www.thunderclient.com/</w:t>
         </w:r>
@@ -4617,7 +4665,7 @@
     <w:p/>
     <w:p>
       <w:pPr>
-        <w:pStyle w:val="Titre3"/>
+        <w:pStyle w:val="Heading3"/>
       </w:pPr>
       <w:r>
         <w:t>## Télécharger le logiciel</w:t>
@@ -4715,7 +4763,7 @@
       <w:hyperlink r:id="rId37" w:history="1">
         <w:r>
           <w:rPr>
-            <w:rStyle w:val="Lienhypertexte"/>
+            <w:rStyle w:val="Hyperlink"/>
           </w:rPr>
           <w:t>http://localhost:3000/api/tasks</w:t>
         </w:r>
@@ -4742,7 +4790,7 @@
       <w:hyperlink r:id="rId38" w:history="1">
         <w:r>
           <w:rPr>
-            <w:rStyle w:val="Lienhypertexte"/>
+            <w:rStyle w:val="Hyperlink"/>
           </w:rPr>
           <w:t>http://localhost:3000/api/tasks/:id</w:t>
         </w:r>
@@ -4771,6 +4819,9 @@
     </w:p>
     <w:p>
       <w:r>
+        <w:rPr>
+          <w:noProof/>
+        </w:rPr>
         <w:drawing>
           <wp:inline distT="0" distB="0" distL="0" distR="0" wp14:anchorId="51AC12BD" wp14:editId="0D84E24C">
             <wp:extent cx="3852333" cy="1299490"/>
@@ -4816,6 +4867,9 @@
     </w:p>
     <w:p>
       <w:r>
+        <w:rPr>
+          <w:noProof/>
+        </w:rPr>
         <w:drawing>
           <wp:inline distT="0" distB="0" distL="0" distR="0" wp14:anchorId="1FB8BB1B" wp14:editId="0CEED0AE">
             <wp:extent cx="2676899" cy="438211"/>
@@ -4856,7 +4910,7 @@
     <w:p/>
     <w:p>
       <w:pPr>
-        <w:pStyle w:val="Titre3"/>
+        <w:pStyle w:val="Heading3"/>
       </w:pPr>
       <w:r>
         <w:t xml:space="preserve">### Créer un nouveau document de test avec </w:t>
@@ -4874,8 +4928,11 @@
     </w:p>
     <w:p>
       <w:r>
+        <w:rPr>
+          <w:noProof/>
+        </w:rPr>
         <w:drawing>
-          <wp:inline distT="0" distB="0" distL="0" distR="0" wp14:anchorId="4D5A6A0D" wp14:editId="2B3932B6">
+          <wp:inline distT="0" distB="0" distL="0" distR="0" wp14:anchorId="4D5A6A0D" wp14:editId="5AABDCE3">
             <wp:extent cx="5760720" cy="1672590"/>
             <wp:effectExtent l="0" t="0" r="0" b="3810"/>
             <wp:docPr id="642178418" name="Image 6">
@@ -4935,6 +4992,9 @@
     </w:p>
     <w:p>
       <w:r>
+        <w:rPr>
+          <w:noProof/>
+        </w:rPr>
         <w:drawing>
           <wp:inline distT="0" distB="0" distL="0" distR="0" wp14:anchorId="20A3603F" wp14:editId="30F5A283">
             <wp:extent cx="5760720" cy="2842895"/>
@@ -4996,9 +5056,12 @@
     </w:p>
     <w:p>
       <w:r>
+        <w:rPr>
+          <w:noProof/>
+        </w:rPr>
         <w:lastRenderedPageBreak/>
         <w:drawing>
-          <wp:inline distT="0" distB="0" distL="0" distR="0" wp14:anchorId="36B01D77" wp14:editId="036ECC0B">
+          <wp:inline distT="0" distB="0" distL="0" distR="0" wp14:anchorId="36B01D77" wp14:editId="1121D9C4">
             <wp:extent cx="5760720" cy="2275205"/>
             <wp:effectExtent l="0" t="0" r="0" b="0"/>
             <wp:docPr id="935579842" name="Image 4">
@@ -5136,7 +5199,7 @@
     <w:p/>
     <w:p>
       <w:pPr>
-        <w:pStyle w:val="Titre2"/>
+        <w:pStyle w:val="Heading2"/>
       </w:pPr>
       <w:r>
         <w:t>## Exporter un document :</w:t>
@@ -5177,6 +5240,9 @@
     </w:p>
     <w:p>
       <w:r>
+        <w:rPr>
+          <w:noProof/>
+        </w:rPr>
         <w:drawing>
           <wp:inline distT="0" distB="0" distL="0" distR="0" wp14:anchorId="2B700007" wp14:editId="7EA983E2">
             <wp:extent cx="4107180" cy="2938226"/>
@@ -5277,6 +5343,9 @@
     </w:p>
     <w:p>
       <w:r>
+        <w:rPr>
+          <w:noProof/>
+        </w:rPr>
         <w:drawing>
           <wp:inline distT="0" distB="0" distL="0" distR="0" wp14:anchorId="02BDC39F" wp14:editId="56BBA013">
             <wp:extent cx="5760720" cy="2841625"/>
@@ -5367,14 +5436,14 @@
       <w:hyperlink r:id="rId51" w:anchor="les-controlleurs" w:history="1">
         <w:r>
           <w:rPr>
-            <w:rStyle w:val="Lienhypertexte"/>
+            <w:rStyle w:val="Hyperlink"/>
           </w:rPr>
           <w:t xml:space="preserve">Revenir à la suite du cours Express - Les </w:t>
         </w:r>
         <w:proofErr w:type="spellStart"/>
         <w:r>
           <w:rPr>
-            <w:rStyle w:val="Lienhypertexte"/>
+            <w:rStyle w:val="Hyperlink"/>
           </w:rPr>
           <w:t>controlleurs</w:t>
         </w:r>
@@ -5384,7 +5453,7 @@
     <w:p/>
     <w:p>
       <w:pPr>
-        <w:pStyle w:val="Titre1"/>
+        <w:pStyle w:val="Heading1"/>
       </w:pPr>
       <w:r>
         <w:t xml:space="preserve"># Web API avec </w:t>
@@ -5400,7 +5469,7 @@
     </w:p>
     <w:p>
       <w:pPr>
-        <w:pStyle w:val="Titre2"/>
+        <w:pStyle w:val="Heading2"/>
       </w:pPr>
       <w:r>
         <w:t>## Connecter son API avec une DB</w:t>
@@ -5408,7 +5477,7 @@
     </w:p>
     <w:p>
       <w:pPr>
-        <w:pStyle w:val="Titre3"/>
+        <w:pStyle w:val="Heading3"/>
       </w:pPr>
       <w:r>
         <w:t xml:space="preserve">### </w:t>
@@ -5483,7 +5552,7 @@
     <w:p/>
     <w:p>
       <w:pPr>
-        <w:pStyle w:val="Titre3"/>
+        <w:pStyle w:val="Heading3"/>
       </w:pPr>
       <w:r>
         <w:t xml:space="preserve">### </w:t>
@@ -5502,7 +5571,7 @@
         <w:proofErr w:type="spellStart"/>
         <w:r>
           <w:rPr>
-            <w:rStyle w:val="Lienhypertexte"/>
+            <w:rStyle w:val="Hyperlink"/>
           </w:rPr>
           <w:t>Sequelize</w:t>
         </w:r>
@@ -5517,7 +5586,7 @@
         <w:proofErr w:type="spellStart"/>
         <w:r>
           <w:rPr>
-            <w:rStyle w:val="Lienhypertexte"/>
+            <w:rStyle w:val="Hyperlink"/>
           </w:rPr>
           <w:t>TypeOrm</w:t>
         </w:r>
@@ -5538,7 +5607,7 @@
     <w:p/>
     <w:p>
       <w:pPr>
-        <w:pStyle w:val="Titre3"/>
+        <w:pStyle w:val="Heading3"/>
       </w:pPr>
       <w:r>
         <w:t xml:space="preserve">### </w:t>
@@ -5557,7 +5626,7 @@
         <w:proofErr w:type="spellStart"/>
         <w:r>
           <w:rPr>
-            <w:rStyle w:val="Lienhypertexte"/>
+            <w:rStyle w:val="Hyperlink"/>
           </w:rPr>
           <w:t>Mongoose</w:t>
         </w:r>
@@ -5569,7 +5638,7 @@
     </w:p>
     <w:p>
       <w:pPr>
-        <w:pStyle w:val="Titre2"/>
+        <w:pStyle w:val="Heading2"/>
         <w:rPr>
           <w:lang w:val="en-GB"/>
         </w:rPr>
@@ -5640,7 +5709,7 @@
     <w:p/>
     <w:p>
       <w:pPr>
-        <w:pStyle w:val="Titre3"/>
+        <w:pStyle w:val="Heading3"/>
       </w:pPr>
       <w:r>
         <w:t xml:space="preserve">### Établir une </w:t>
@@ -5676,6 +5745,9 @@
     </w:p>
     <w:p>
       <w:r>
+        <w:rPr>
+          <w:noProof/>
+        </w:rPr>
         <w:drawing>
           <wp:inline distT="0" distB="0" distL="0" distR="0" wp14:anchorId="327D56E5" wp14:editId="0B9AA696">
             <wp:extent cx="6265333" cy="3596075"/>
@@ -5839,6 +5911,9 @@
     </w:p>
     <w:p>
       <w:r>
+        <w:rPr>
+          <w:noProof/>
+        </w:rPr>
         <w:drawing>
           <wp:inline distT="0" distB="0" distL="0" distR="0" wp14:anchorId="2106E98C" wp14:editId="39387536">
             <wp:extent cx="1630680" cy="681607"/>
@@ -5929,6 +6004,9 @@
     </w:p>
     <w:p>
       <w:r>
+        <w:rPr>
+          <w:noProof/>
+        </w:rPr>
         <w:drawing>
           <wp:inline distT="0" distB="0" distL="0" distR="0" wp14:anchorId="517C8BB8" wp14:editId="7F1D88E5">
             <wp:extent cx="5760720" cy="679450"/>
@@ -5979,6 +6057,9 @@
     </w:p>
     <w:p>
       <w:r>
+        <w:rPr>
+          <w:noProof/>
+        </w:rPr>
         <w:drawing>
           <wp:inline distT="0" distB="0" distL="0" distR="0" wp14:anchorId="0FACE467" wp14:editId="6D7AFEE9">
             <wp:extent cx="5760720" cy="673735"/>
@@ -6019,7 +6100,7 @@
     <w:p/>
     <w:p>
       <w:pPr>
-        <w:pStyle w:val="Titre3"/>
+        <w:pStyle w:val="Heading3"/>
       </w:pPr>
       <w:r>
         <w:t>### Créer les modèles de données de notre DB :</w:t>
@@ -6108,6 +6189,7 @@
     <w:p>
       <w:r>
         <w:rPr>
+          <w:noProof/>
           <w:lang w:val="en-GB"/>
         </w:rPr>
         <w:drawing>
@@ -6175,6 +6257,7 @@
     <w:p>
       <w:r>
         <w:rPr>
+          <w:noProof/>
           <w:lang w:val="en-GB"/>
         </w:rPr>
         <w:lastRenderedPageBreak/>
@@ -6243,6 +6326,9 @@
         </w:rPr>
       </w:pPr>
       <w:r>
+        <w:rPr>
+          <w:noProof/>
+        </w:rPr>
         <w:drawing>
           <wp:inline distT="0" distB="0" distL="0" distR="0" wp14:anchorId="279DA933" wp14:editId="6B107EA3">
             <wp:extent cx="5760720" cy="1453515"/>
@@ -6302,6 +6388,9 @@
     </w:p>
     <w:p>
       <w:r>
+        <w:rPr>
+          <w:noProof/>
+        </w:rPr>
         <w:drawing>
           <wp:inline distT="0" distB="0" distL="0" distR="0" wp14:anchorId="0D36CAD9" wp14:editId="02FD166F">
             <wp:extent cx="5760720" cy="2225040"/>
@@ -6397,6 +6486,9 @@
     </w:p>
     <w:p>
       <w:r>
+        <w:rPr>
+          <w:noProof/>
+        </w:rPr>
         <w:lastRenderedPageBreak/>
         <w:drawing>
           <wp:inline distT="0" distB="0" distL="0" distR="0" wp14:anchorId="71D519F8" wp14:editId="5118DBB6">
@@ -6581,40 +6673,20 @@
     <w:p>
       <w:r>
         <w:rPr>
-          <w:i/>
-          <w:iCs/>
-        </w:rPr>
-        <w:t xml:space="preserve">Exemple avec le </w:t>
-      </w:r>
-      <w:proofErr w:type="spellStart"/>
-      <w:r>
-        <w:rPr>
-          <w:i/>
-          <w:iCs/>
-        </w:rPr>
-        <w:t>find</w:t>
-      </w:r>
-      <w:proofErr w:type="spellEnd"/>
-      <w:r>
-        <w:rPr>
-          <w:i/>
-          <w:iCs/>
-        </w:rPr>
-        <w:t xml:space="preserve"> de category.service.js :</w:t>
-      </w:r>
-    </w:p>
-    <w:p>
-      <w:pPr>
-        <w:rPr>
-          <w:i/>
-          <w:iCs/>
-        </w:rPr>
-      </w:pPr>
-      <w:r>
+          <w:noProof/>
+        </w:rPr>
         <w:drawing>
-          <wp:inline distT="0" distB="0" distL="0" distR="0" wp14:anchorId="43A1D567" wp14:editId="27EDF503">
-            <wp:extent cx="5760720" cy="1370330"/>
-            <wp:effectExtent l="0" t="0" r="0" b="1270"/>
+          <wp:anchor distT="0" distB="0" distL="114300" distR="114300" simplePos="0" relativeHeight="251659264" behindDoc="0" locked="0" layoutInCell="1" allowOverlap="1" wp14:anchorId="43A1D567" wp14:editId="36783540">
+            <wp:simplePos x="0" y="0"/>
+            <wp:positionH relativeFrom="margin">
+              <wp:align>center</wp:align>
+            </wp:positionH>
+            <wp:positionV relativeFrom="paragraph">
+              <wp:posOffset>340995</wp:posOffset>
+            </wp:positionV>
+            <wp:extent cx="6800850" cy="1617345"/>
+            <wp:effectExtent l="0" t="0" r="0" b="1905"/>
+            <wp:wrapSquare wrapText="bothSides"/>
             <wp:docPr id="1365615127" name="Image 1"/>
             <wp:cNvGraphicFramePr>
               <a:graphicFrameLocks xmlns:a="http://schemas.openxmlformats.org/drawingml/2006/main" noChangeAspect="1"/>
@@ -6627,7 +6699,13 @@
                     <pic:cNvPicPr/>
                   </pic:nvPicPr>
                   <pic:blipFill>
-                    <a:blip r:embed="rId64"/>
+                    <a:blip r:embed="rId64">
+                      <a:extLst>
+                        <a:ext uri="{28A0092B-C50C-407E-A947-70E740481C1C}">
+                          <a14:useLocalDpi xmlns:a14="http://schemas.microsoft.com/office/drawing/2010/main" val="0"/>
+                        </a:ext>
+                      </a:extLst>
+                    </a:blip>
                     <a:stretch>
                       <a:fillRect/>
                     </a:stretch>
@@ -6635,7 +6713,7 @@
                   <pic:spPr>
                     <a:xfrm>
                       <a:off x="0" y="0"/>
-                      <a:ext cx="5760720" cy="1370330"/>
+                      <a:ext cx="6800850" cy="1617345"/>
                     </a:xfrm>
                     <a:prstGeom prst="rect">
                       <a:avLst/>
@@ -6644,33 +6722,38 @@
                 </pic:pic>
               </a:graphicData>
             </a:graphic>
-          </wp:inline>
+            <wp14:sizeRelH relativeFrom="margin">
+              <wp14:pctWidth>0</wp14:pctWidth>
+            </wp14:sizeRelH>
+            <wp14:sizeRelV relativeFrom="margin">
+              <wp14:pctHeight>0</wp14:pctHeight>
+            </wp14:sizeRelV>
+          </wp:anchor>
         </w:drawing>
       </w:r>
-    </w:p>
-    <w:p>
-      <w:pPr>
+      <w:r>
         <w:rPr>
           <w:i/>
           <w:iCs/>
         </w:rPr>
-      </w:pPr>
-    </w:p>
-    <w:p>
-      <w:pPr>
+        <w:t xml:space="preserve">Exemple avec le </w:t>
+      </w:r>
+      <w:proofErr w:type="spellStart"/>
+      <w:r>
         <w:rPr>
           <w:i/>
           <w:iCs/>
         </w:rPr>
-      </w:pPr>
-    </w:p>
-    <w:p>
-      <w:pPr>
+        <w:t>find</w:t>
+      </w:r>
+      <w:proofErr w:type="spellEnd"/>
+      <w:r>
         <w:rPr>
           <w:i/>
           <w:iCs/>
         </w:rPr>
-      </w:pPr>
+        <w:t xml:space="preserve"> de category.service.js :</w:t>
+      </w:r>
     </w:p>
     <w:p>
       <w:pPr>
@@ -6705,17 +6788,51 @@
       </w:pPr>
     </w:p>
     <w:p>
-      <w:r>
+      <w:pPr>
         <w:rPr>
           <w:i/>
           <w:iCs/>
         </w:rPr>
-        <w:lastRenderedPageBreak/>
+      </w:pPr>
+    </w:p>
+    <w:p>
+      <w:pPr>
+        <w:rPr>
+          <w:i/>
+          <w:iCs/>
+        </w:rPr>
+      </w:pPr>
+    </w:p>
+    <w:p>
+      <w:pPr>
+        <w:rPr>
+          <w:i/>
+          <w:iCs/>
+        </w:rPr>
+      </w:pPr>
+    </w:p>
+    <w:p>
+      <w:pPr>
+        <w:rPr>
+          <w:i/>
+          <w:iCs/>
+        </w:rPr>
+      </w:pPr>
+    </w:p>
+    <w:p>
+      <w:r>
+        <w:rPr>
+          <w:i/>
+          <w:iCs/>
+        </w:rPr>
         <w:t>Et ensuite, dans le category.controller.js :</w:t>
       </w:r>
     </w:p>
     <w:p>
       <w:r>
+        <w:rPr>
+          <w:noProof/>
+        </w:rPr>
         <w:drawing>
           <wp:inline distT="0" distB="0" distL="0" distR="0" wp14:anchorId="5005EF79" wp14:editId="4DB8B1A1">
             <wp:extent cx="5760720" cy="2071370"/>
@@ -6940,7 +7057,7 @@
     <w:p/>
     <w:p>
       <w:pPr>
-        <w:pStyle w:val="Titre3"/>
+        <w:pStyle w:val="Heading3"/>
       </w:pPr>
       <w:r>
         <w:lastRenderedPageBreak/>
@@ -6954,6 +7071,9 @@
     </w:p>
     <w:p>
       <w:r>
+        <w:rPr>
+          <w:noProof/>
+        </w:rPr>
         <w:drawing>
           <wp:inline distT="0" distB="0" distL="0" distR="0" wp14:anchorId="35478755" wp14:editId="529BF33D">
             <wp:extent cx="5760720" cy="3847465"/>
@@ -6994,7 +7114,7 @@
     <w:p/>
     <w:p>
       <w:pPr>
-        <w:pStyle w:val="Titre2"/>
+        <w:pStyle w:val="Heading2"/>
       </w:pPr>
       <w:r>
         <w:t>## Hasher des données</w:t>
@@ -7060,7 +7180,7 @@
       <w:hyperlink r:id="rId67" w:history="1">
         <w:r>
           <w:rPr>
-            <w:rStyle w:val="Lienhypertexte"/>
+            <w:rStyle w:val="Hyperlink"/>
           </w:rPr>
           <w:t>https://www.npmjs.com/package//argon2</w:t>
         </w:r>
@@ -7080,7 +7200,7 @@
     <w:p/>
     <w:p>
       <w:pPr>
-        <w:pStyle w:val="Titre3"/>
+        <w:pStyle w:val="Heading3"/>
       </w:pPr>
       <w:r>
         <w:t>### Installer Argon2 :</w:t>
@@ -7143,7 +7263,7 @@
     </w:p>
     <w:p>
       <w:pPr>
-        <w:pStyle w:val="Titre3"/>
+        <w:pStyle w:val="Heading3"/>
         <w:rPr>
           <w:lang w:val="en-GB"/>
         </w:rPr>
@@ -7176,6 +7296,7 @@
     <w:p>
       <w:r>
         <w:rPr>
+          <w:noProof/>
           <w:lang w:val="en-GB"/>
         </w:rPr>
         <w:drawing>
@@ -7217,7 +7338,7 @@
     </w:p>
     <w:p>
       <w:pPr>
-        <w:pStyle w:val="Titre3"/>
+        <w:pStyle w:val="Heading3"/>
       </w:pPr>
       <w:r>
         <w:t xml:space="preserve">### Vérification du </w:t>
@@ -7247,6 +7368,7 @@
     <w:p>
       <w:r>
         <w:rPr>
+          <w:noProof/>
           <w:lang w:val="en-GB"/>
         </w:rPr>
         <w:drawing>
@@ -7289,7 +7411,7 @@
     <w:p/>
     <w:p>
       <w:pPr>
-        <w:pStyle w:val="Titre2"/>
+        <w:pStyle w:val="Heading2"/>
       </w:pPr>
       <w:r>
         <w:t>## Rajouter l'authentification avec JWT</w:t>
@@ -7318,7 +7440,7 @@
       <w:hyperlink r:id="rId70" w:history="1">
         <w:r>
           <w:rPr>
-            <w:rStyle w:val="Lienhypertexte"/>
+            <w:rStyle w:val="Hyperlink"/>
           </w:rPr>
           <w:t>https://en.wikipedia.org/wiki/JSON_Web_Token</w:t>
         </w:r>
@@ -7335,7 +7457,7 @@
     <w:p/>
     <w:p>
       <w:pPr>
-        <w:pStyle w:val="Titre3"/>
+        <w:pStyle w:val="Heading3"/>
       </w:pPr>
       <w:r>
         <w:t xml:space="preserve">### Installer </w:t>
@@ -7406,7 +7528,7 @@
     </w:p>
     <w:p>
       <w:pPr>
-        <w:pStyle w:val="Titre3"/>
+        <w:pStyle w:val="Heading3"/>
       </w:pPr>
       <w:r>
         <w:t xml:space="preserve">### Créer un </w:t>
@@ -7637,6 +7759,9 @@
     </w:p>
     <w:p>
       <w:r>
+        <w:rPr>
+          <w:noProof/>
+        </w:rPr>
         <w:drawing>
           <wp:inline distT="0" distB="0" distL="0" distR="0" wp14:anchorId="6D50B13E" wp14:editId="04034981">
             <wp:extent cx="4261133" cy="330200"/>
@@ -7954,6 +8079,9 @@
         <w:ind w:left="708"/>
       </w:pPr>
       <w:r>
+        <w:rPr>
+          <w:noProof/>
+        </w:rPr>
         <w:drawing>
           <wp:inline distT="0" distB="0" distL="0" distR="0" wp14:anchorId="2BD469AF" wp14:editId="0EE73ABD">
             <wp:extent cx="3848637" cy="2019582"/>
@@ -8045,6 +8173,9 @@
     </w:p>
     <w:p>
       <w:r>
+        <w:rPr>
+          <w:noProof/>
+        </w:rPr>
         <w:drawing>
           <wp:inline distT="0" distB="0" distL="0" distR="0" wp14:anchorId="69EC72D3" wp14:editId="59178456">
             <wp:extent cx="1196814" cy="899160"/>
@@ -8193,6 +8324,9 @@
     </w:p>
     <w:p>
       <w:r>
+        <w:rPr>
+          <w:noProof/>
+        </w:rPr>
         <w:drawing>
           <wp:inline distT="0" distB="0" distL="0" distR="0" wp14:anchorId="4A4E1266" wp14:editId="76705C92">
             <wp:extent cx="5760720" cy="2505075"/>
@@ -8233,7 +8367,7 @@
     <w:p/>
     <w:p>
       <w:pPr>
-        <w:pStyle w:val="Titre3"/>
+        <w:pStyle w:val="Heading3"/>
       </w:pPr>
       <w:r>
         <w:t xml:space="preserve">### Envoyer le </w:t>
@@ -8429,6 +8563,9 @@
     </w:p>
     <w:p>
       <w:r>
+        <w:rPr>
+          <w:noProof/>
+        </w:rPr>
         <w:drawing>
           <wp:inline distT="0" distB="0" distL="0" distR="0" wp14:anchorId="63AE3B44" wp14:editId="0B6E484C">
             <wp:extent cx="5760720" cy="2192020"/>
@@ -8493,6 +8630,9 @@
     </w:p>
     <w:p>
       <w:r>
+        <w:rPr>
+          <w:noProof/>
+        </w:rPr>
         <w:drawing>
           <wp:inline distT="0" distB="0" distL="0" distR="0" wp14:anchorId="2E2485FB" wp14:editId="2B19A1DA">
             <wp:extent cx="5760720" cy="3096260"/>
@@ -8562,6 +8702,9 @@
     </w:p>
     <w:p>
       <w:r>
+        <w:rPr>
+          <w:noProof/>
+        </w:rPr>
         <w:drawing>
           <wp:inline distT="0" distB="0" distL="0" distR="0" wp14:anchorId="4A34C5B3" wp14:editId="164CED1A">
             <wp:extent cx="5760720" cy="3508375"/>
@@ -8619,7 +8762,7 @@
     <w:p/>
     <w:p>
       <w:pPr>
-        <w:pStyle w:val="Titre3"/>
+        <w:pStyle w:val="Heading3"/>
       </w:pPr>
       <w:r>
         <w:t xml:space="preserve">### Création de middlewares pour récup le </w:t>
@@ -8648,7 +8791,7 @@
     </w:p>
     <w:p>
       <w:pPr>
-        <w:pStyle w:val="Paragraphedeliste"/>
+        <w:pStyle w:val="ListParagraph"/>
         <w:numPr>
           <w:ilvl w:val="0"/>
           <w:numId w:val="1"/>
@@ -8682,20 +8825,18 @@
       </w:r>
       <w:proofErr w:type="spellEnd"/>
       <w:r>
-        <w:t xml:space="preserve"> est envoyé, donc si l'utilisateur est bien </w:t>
-      </w:r>
-      <w:proofErr w:type="spellStart"/>
-      <w:r>
-        <w:t>connécté</w:t>
-      </w:r>
-      <w:proofErr w:type="spellEnd"/>
-      <w:r>
-        <w:t>. </w:t>
-      </w:r>
-    </w:p>
-    <w:p>
-      <w:pPr>
-        <w:pStyle w:val="Paragraphedeliste"/>
+        <w:t xml:space="preserve"> est envoyé, donc si l'utilisateur est bien conn</w:t>
+      </w:r>
+      <w:r>
+        <w:t>e</w:t>
+      </w:r>
+      <w:r>
+        <w:t>cté. </w:t>
+      </w:r>
+    </w:p>
+    <w:p>
+      <w:pPr>
+        <w:pStyle w:val="ListParagraph"/>
         <w:numPr>
           <w:ilvl w:val="0"/>
           <w:numId w:val="1"/>
@@ -8743,7 +8884,7 @@
     </w:p>
     <w:p>
       <w:pPr>
-        <w:pStyle w:val="Paragraphedeliste"/>
+        <w:pStyle w:val="ListParagraph"/>
         <w:numPr>
           <w:ilvl w:val="0"/>
           <w:numId w:val="1"/>
@@ -8804,6 +8945,9 @@
         </w:rPr>
       </w:pPr>
       <w:r>
+        <w:rPr>
+          <w:noProof/>
+        </w:rPr>
         <w:drawing>
           <wp:inline distT="0" distB="0" distL="0" distR="0" wp14:anchorId="05BF488F" wp14:editId="0B91B9B6">
             <wp:extent cx="3657600" cy="1639330"/>
@@ -8861,6 +9005,7 @@
       </w:pPr>
       <w:r>
         <w:rPr>
+          <w:noProof/>
           <w:lang w:val="en-GB"/>
         </w:rPr>
         <w:drawing>
@@ -8909,7 +9054,7 @@
     </w:p>
     <w:p>
       <w:pPr>
-        <w:pStyle w:val="Titre3"/>
+        <w:pStyle w:val="Heading3"/>
       </w:pPr>
       <w:r>
         <w:t xml:space="preserve">### Déchiffrer le </w:t>
@@ -8957,6 +9102,7 @@
     <w:p>
       <w:r>
         <w:rPr>
+          <w:noProof/>
           <w:lang w:val="en-GB"/>
         </w:rPr>
         <w:drawing>
@@ -9067,7 +9213,7 @@
     <w:p/>
     <w:p>
       <w:pPr>
-        <w:pStyle w:val="Titre2"/>
+        <w:pStyle w:val="Heading2"/>
       </w:pPr>
       <w:r>
         <w:lastRenderedPageBreak/>
@@ -9092,7 +9238,7 @@
       <w:hyperlink r:id="rId84" w:history="1">
         <w:r>
           <w:rPr>
-            <w:rStyle w:val="Lienhypertexte"/>
+            <w:rStyle w:val="Hyperlink"/>
           </w:rPr>
           <w:t>https://www.npmjs.com/package/multer</w:t>
         </w:r>
@@ -9106,7 +9252,7 @@
       <w:hyperlink r:id="rId85" w:history="1">
         <w:r>
           <w:rPr>
-            <w:rStyle w:val="Lienhypertexte"/>
+            <w:rStyle w:val="Hyperlink"/>
           </w:rPr>
           <w:t>https://gitlab.com/i3namurfs/demonodemulterfsi3namur</w:t>
         </w:r>
@@ -9118,7 +9264,7 @@
     <w:p/>
     <w:p>
       <w:pPr>
-        <w:pStyle w:val="Titre2"/>
+        <w:pStyle w:val="Heading2"/>
       </w:pPr>
       <w:r>
         <w:t>## Validation des données entrantes</w:t>
@@ -9131,7 +9277,7 @@
       <w:hyperlink r:id="rId86" w:history="1">
         <w:r>
           <w:rPr>
-            <w:rStyle w:val="Lienhypertexte"/>
+            <w:rStyle w:val="Hyperlink"/>
           </w:rPr>
           <w:t>Yup</w:t>
         </w:r>
@@ -9147,7 +9293,7 @@
       <w:hyperlink r:id="rId87" w:history="1">
         <w:r>
           <w:rPr>
-            <w:rStyle w:val="Lienhypertexte"/>
+            <w:rStyle w:val="Hyperlink"/>
           </w:rPr>
           <w:t>projet</w:t>
         </w:r>
@@ -9248,7 +9394,7 @@
     <w:p/>
     <w:p>
       <w:pPr>
-        <w:pStyle w:val="Titre2"/>
+        <w:pStyle w:val="Heading2"/>
       </w:pPr>
       <w:r>
         <w:t>## Mise en place de Swagger</w:t>
@@ -9258,7 +9404,7 @@
       <w:hyperlink r:id="rId88" w:history="1">
         <w:r>
           <w:rPr>
-            <w:rStyle w:val="Lienhypertexte"/>
+            <w:rStyle w:val="Hyperlink"/>
           </w:rPr>
           <w:t>Swagger</w:t>
         </w:r>
@@ -9287,6 +9433,9 @@
     </w:p>
     <w:p>
       <w:r>
+        <w:rPr>
+          <w:noProof/>
+        </w:rPr>
         <w:drawing>
           <wp:inline distT="0" distB="0" distL="0" distR="0" wp14:anchorId="7ECC2099" wp14:editId="63226BAA">
             <wp:extent cx="4983480" cy="2866380"/>
@@ -9348,21 +9497,21 @@
       <w:hyperlink r:id="rId91" w:history="1">
         <w:r>
           <w:rPr>
-            <w:rStyle w:val="Lienhypertexte"/>
+            <w:rStyle w:val="Hyperlink"/>
           </w:rPr>
           <w:t xml:space="preserve">librairie </w:t>
         </w:r>
         <w:proofErr w:type="spellStart"/>
         <w:r>
           <w:rPr>
-            <w:rStyle w:val="Lienhypertexte"/>
+            <w:rStyle w:val="Hyperlink"/>
           </w:rPr>
           <w:t>js</w:t>
         </w:r>
         <w:proofErr w:type="spellEnd"/>
         <w:r>
           <w:rPr>
-            <w:rStyle w:val="Lienhypertexte"/>
+            <w:rStyle w:val="Hyperlink"/>
           </w:rPr>
           <w:t xml:space="preserve"> Swagger</w:t>
         </w:r>
@@ -9374,7 +9523,7 @@
     <w:p/>
     <w:p>
       <w:pPr>
-        <w:pStyle w:val="Titre2"/>
+        <w:pStyle w:val="Heading2"/>
       </w:pPr>
       <w:r>
         <w:t>## Bonus</w:t>
@@ -9382,7 +9531,7 @@
     </w:p>
     <w:p>
       <w:pPr>
-        <w:pStyle w:val="Titre3"/>
+        <w:pStyle w:val="Heading3"/>
       </w:pPr>
       <w:r>
         <w:t xml:space="preserve">### Utilitaires : </w:t>
@@ -9395,7 +9544,7 @@
       <w:hyperlink r:id="rId92" w:history="1">
         <w:r>
           <w:rPr>
-            <w:rStyle w:val="Lienhypertexte"/>
+            <w:rStyle w:val="Hyperlink"/>
           </w:rPr>
           <w:t>TODO+</w:t>
         </w:r>
@@ -9483,7 +9632,7 @@
     <w:p/>
     <w:p>
       <w:pPr>
-        <w:pStyle w:val="Titre3"/>
+        <w:pStyle w:val="Heading3"/>
       </w:pPr>
       <w:r>
         <w:t>### Librairies sympa pour pimper votre API</w:t>
@@ -9493,21 +9642,21 @@
       <w:hyperlink r:id="rId93" w:history="1">
         <w:r>
           <w:rPr>
-            <w:rStyle w:val="Lienhypertexte"/>
+            <w:rStyle w:val="Hyperlink"/>
           </w:rPr>
           <w:t>http-</w:t>
         </w:r>
         <w:proofErr w:type="spellStart"/>
         <w:r>
           <w:rPr>
-            <w:rStyle w:val="Lienhypertexte"/>
+            <w:rStyle w:val="Hyperlink"/>
           </w:rPr>
           <w:t>status</w:t>
         </w:r>
         <w:proofErr w:type="spellEnd"/>
         <w:r>
           <w:rPr>
-            <w:rStyle w:val="Lienhypertexte"/>
+            <w:rStyle w:val="Hyperlink"/>
           </w:rPr>
           <w:t>-code</w:t>
         </w:r>
@@ -9544,6 +9693,9 @@
     </w:p>
     <w:p>
       <w:r>
+        <w:rPr>
+          <w:noProof/>
+        </w:rPr>
         <w:drawing>
           <wp:inline distT="0" distB="0" distL="0" distR="0" wp14:anchorId="3D24B955" wp14:editId="1FDE7D77">
             <wp:extent cx="4602480" cy="380895"/>
@@ -13509,11 +13661,11 @@
     <w:name w:val="Normal"/>
     <w:qFormat/>
   </w:style>
-  <w:style w:type="paragraph" w:styleId="Titre1">
+  <w:style w:type="paragraph" w:styleId="Heading1">
     <w:name w:val="heading 1"/>
     <w:basedOn w:val="Normal"/>
     <w:next w:val="Normal"/>
-    <w:link w:val="Titre1Car"/>
+    <w:link w:val="Heading1Char"/>
     <w:uiPriority w:val="9"/>
     <w:qFormat/>
     <w:rsid w:val="001417B5"/>
@@ -13530,11 +13682,11 @@
       <w:szCs w:val="40"/>
     </w:rPr>
   </w:style>
-  <w:style w:type="paragraph" w:styleId="Titre2">
+  <w:style w:type="paragraph" w:styleId="Heading2">
     <w:name w:val="heading 2"/>
     <w:basedOn w:val="Normal"/>
     <w:next w:val="Normal"/>
-    <w:link w:val="Titre2Car"/>
+    <w:link w:val="Heading2Char"/>
     <w:uiPriority w:val="9"/>
     <w:unhideWhenUsed/>
     <w:qFormat/>
@@ -13552,11 +13704,11 @@
       <w:szCs w:val="32"/>
     </w:rPr>
   </w:style>
-  <w:style w:type="paragraph" w:styleId="Titre3">
+  <w:style w:type="paragraph" w:styleId="Heading3">
     <w:name w:val="heading 3"/>
     <w:basedOn w:val="Normal"/>
     <w:next w:val="Normal"/>
-    <w:link w:val="Titre3Car"/>
+    <w:link w:val="Heading3Char"/>
     <w:uiPriority w:val="9"/>
     <w:unhideWhenUsed/>
     <w:qFormat/>
@@ -13574,11 +13726,11 @@
       <w:szCs w:val="28"/>
     </w:rPr>
   </w:style>
-  <w:style w:type="paragraph" w:styleId="Titre4">
+  <w:style w:type="paragraph" w:styleId="Heading4">
     <w:name w:val="heading 4"/>
     <w:basedOn w:val="Normal"/>
     <w:next w:val="Normal"/>
-    <w:link w:val="Titre4Car"/>
+    <w:link w:val="Heading4Char"/>
     <w:uiPriority w:val="9"/>
     <w:unhideWhenUsed/>
     <w:qFormat/>
@@ -13596,11 +13748,11 @@
       <w:color w:val="0F4761" w:themeColor="accent1" w:themeShade="BF"/>
     </w:rPr>
   </w:style>
-  <w:style w:type="paragraph" w:styleId="Titre5">
+  <w:style w:type="paragraph" w:styleId="Heading5">
     <w:name w:val="heading 5"/>
     <w:basedOn w:val="Normal"/>
     <w:next w:val="Normal"/>
-    <w:link w:val="Titre5Car"/>
+    <w:link w:val="Heading5Char"/>
     <w:uiPriority w:val="9"/>
     <w:semiHidden/>
     <w:unhideWhenUsed/>
@@ -13617,11 +13769,11 @@
       <w:color w:val="0F4761" w:themeColor="accent1" w:themeShade="BF"/>
     </w:rPr>
   </w:style>
-  <w:style w:type="paragraph" w:styleId="Titre6">
+  <w:style w:type="paragraph" w:styleId="Heading6">
     <w:name w:val="heading 6"/>
     <w:basedOn w:val="Normal"/>
     <w:next w:val="Normal"/>
-    <w:link w:val="Titre6Car"/>
+    <w:link w:val="Heading6Char"/>
     <w:uiPriority w:val="9"/>
     <w:semiHidden/>
     <w:unhideWhenUsed/>
@@ -13640,11 +13792,11 @@
       <w:color w:val="595959" w:themeColor="text1" w:themeTint="A6"/>
     </w:rPr>
   </w:style>
-  <w:style w:type="paragraph" w:styleId="Titre7">
+  <w:style w:type="paragraph" w:styleId="Heading7">
     <w:name w:val="heading 7"/>
     <w:basedOn w:val="Normal"/>
     <w:next w:val="Normal"/>
-    <w:link w:val="Titre7Car"/>
+    <w:link w:val="Heading7Char"/>
     <w:uiPriority w:val="9"/>
     <w:semiHidden/>
     <w:unhideWhenUsed/>
@@ -13661,11 +13813,11 @@
       <w:color w:val="595959" w:themeColor="text1" w:themeTint="A6"/>
     </w:rPr>
   </w:style>
-  <w:style w:type="paragraph" w:styleId="Titre8">
+  <w:style w:type="paragraph" w:styleId="Heading8">
     <w:name w:val="heading 8"/>
     <w:basedOn w:val="Normal"/>
     <w:next w:val="Normal"/>
-    <w:link w:val="Titre8Car"/>
+    <w:link w:val="Heading8Char"/>
     <w:uiPriority w:val="9"/>
     <w:semiHidden/>
     <w:unhideWhenUsed/>
@@ -13684,11 +13836,11 @@
       <w:color w:val="272727" w:themeColor="text1" w:themeTint="D8"/>
     </w:rPr>
   </w:style>
-  <w:style w:type="paragraph" w:styleId="Titre9">
+  <w:style w:type="paragraph" w:styleId="Heading9">
     <w:name w:val="heading 9"/>
     <w:basedOn w:val="Normal"/>
     <w:next w:val="Normal"/>
-    <w:link w:val="Titre9Car"/>
+    <w:link w:val="Heading9Char"/>
     <w:uiPriority w:val="9"/>
     <w:semiHidden/>
     <w:unhideWhenUsed/>
@@ -13705,12 +13857,13 @@
       <w:color w:val="272727" w:themeColor="text1" w:themeTint="D8"/>
     </w:rPr>
   </w:style>
-  <w:style w:type="character" w:default="1" w:styleId="Policepardfaut">
+  <w:style w:type="character" w:default="1" w:styleId="DefaultParagraphFont">
     <w:name w:val="Default Paragraph Font"/>
     <w:uiPriority w:val="1"/>
+    <w:semiHidden/>
     <w:unhideWhenUsed/>
   </w:style>
-  <w:style w:type="table" w:default="1" w:styleId="TableauNormal">
+  <w:style w:type="table" w:default="1" w:styleId="TableNormal">
     <w:name w:val="Normal Table"/>
     <w:uiPriority w:val="99"/>
     <w:semiHidden/>
@@ -13725,16 +13878,16 @@
       </w:tblCellMar>
     </w:tblPr>
   </w:style>
-  <w:style w:type="numbering" w:default="1" w:styleId="Aucuneliste">
+  <w:style w:type="numbering" w:default="1" w:styleId="NoList">
     <w:name w:val="No List"/>
     <w:uiPriority w:val="99"/>
     <w:semiHidden/>
     <w:unhideWhenUsed/>
   </w:style>
-  <w:style w:type="character" w:customStyle="1" w:styleId="Titre1Car">
-    <w:name w:val="Titre 1 Car"/>
-    <w:basedOn w:val="Policepardfaut"/>
-    <w:link w:val="Titre1"/>
+  <w:style w:type="character" w:customStyle="1" w:styleId="Heading1Char">
+    <w:name w:val="Heading 1 Char"/>
+    <w:basedOn w:val="DefaultParagraphFont"/>
+    <w:link w:val="Heading1"/>
     <w:uiPriority w:val="9"/>
     <w:rsid w:val="001417B5"/>
     <w:rPr>
@@ -13744,10 +13897,10 @@
       <w:szCs w:val="40"/>
     </w:rPr>
   </w:style>
-  <w:style w:type="character" w:customStyle="1" w:styleId="Titre2Car">
-    <w:name w:val="Titre 2 Car"/>
-    <w:basedOn w:val="Policepardfaut"/>
-    <w:link w:val="Titre2"/>
+  <w:style w:type="character" w:customStyle="1" w:styleId="Heading2Char">
+    <w:name w:val="Heading 2 Char"/>
+    <w:basedOn w:val="DefaultParagraphFont"/>
+    <w:link w:val="Heading2"/>
     <w:uiPriority w:val="9"/>
     <w:rsid w:val="001417B5"/>
     <w:rPr>
@@ -13757,10 +13910,10 @@
       <w:szCs w:val="32"/>
     </w:rPr>
   </w:style>
-  <w:style w:type="character" w:customStyle="1" w:styleId="Titre3Car">
-    <w:name w:val="Titre 3 Car"/>
-    <w:basedOn w:val="Policepardfaut"/>
-    <w:link w:val="Titre3"/>
+  <w:style w:type="character" w:customStyle="1" w:styleId="Heading3Char">
+    <w:name w:val="Heading 3 Char"/>
+    <w:basedOn w:val="DefaultParagraphFont"/>
+    <w:link w:val="Heading3"/>
     <w:uiPriority w:val="9"/>
     <w:rsid w:val="001417B5"/>
     <w:rPr>
@@ -13770,10 +13923,10 @@
       <w:szCs w:val="28"/>
     </w:rPr>
   </w:style>
-  <w:style w:type="character" w:customStyle="1" w:styleId="Titre4Car">
-    <w:name w:val="Titre 4 Car"/>
-    <w:basedOn w:val="Policepardfaut"/>
-    <w:link w:val="Titre4"/>
+  <w:style w:type="character" w:customStyle="1" w:styleId="Heading4Char">
+    <w:name w:val="Heading 4 Char"/>
+    <w:basedOn w:val="DefaultParagraphFont"/>
+    <w:link w:val="Heading4"/>
     <w:uiPriority w:val="9"/>
     <w:rsid w:val="001417B5"/>
     <w:rPr>
@@ -13783,10 +13936,10 @@
       <w:color w:val="0F4761" w:themeColor="accent1" w:themeShade="BF"/>
     </w:rPr>
   </w:style>
-  <w:style w:type="character" w:customStyle="1" w:styleId="Titre5Car">
-    <w:name w:val="Titre 5 Car"/>
-    <w:basedOn w:val="Policepardfaut"/>
-    <w:link w:val="Titre5"/>
+  <w:style w:type="character" w:customStyle="1" w:styleId="Heading5Char">
+    <w:name w:val="Heading 5 Char"/>
+    <w:basedOn w:val="DefaultParagraphFont"/>
+    <w:link w:val="Heading5"/>
     <w:uiPriority w:val="9"/>
     <w:semiHidden/>
     <w:rsid w:val="001417B5"/>
@@ -13795,10 +13948,10 @@
       <w:color w:val="0F4761" w:themeColor="accent1" w:themeShade="BF"/>
     </w:rPr>
   </w:style>
-  <w:style w:type="character" w:customStyle="1" w:styleId="Titre6Car">
-    <w:name w:val="Titre 6 Car"/>
-    <w:basedOn w:val="Policepardfaut"/>
-    <w:link w:val="Titre6"/>
+  <w:style w:type="character" w:customStyle="1" w:styleId="Heading6Char">
+    <w:name w:val="Heading 6 Char"/>
+    <w:basedOn w:val="DefaultParagraphFont"/>
+    <w:link w:val="Heading6"/>
     <w:uiPriority w:val="9"/>
     <w:semiHidden/>
     <w:rsid w:val="001417B5"/>
@@ -13809,10 +13962,10 @@
       <w:color w:val="595959" w:themeColor="text1" w:themeTint="A6"/>
     </w:rPr>
   </w:style>
-  <w:style w:type="character" w:customStyle="1" w:styleId="Titre7Car">
-    <w:name w:val="Titre 7 Car"/>
-    <w:basedOn w:val="Policepardfaut"/>
-    <w:link w:val="Titre7"/>
+  <w:style w:type="character" w:customStyle="1" w:styleId="Heading7Char">
+    <w:name w:val="Heading 7 Char"/>
+    <w:basedOn w:val="DefaultParagraphFont"/>
+    <w:link w:val="Heading7"/>
     <w:uiPriority w:val="9"/>
     <w:semiHidden/>
     <w:rsid w:val="001417B5"/>
@@ -13821,10 +13974,10 @@
       <w:color w:val="595959" w:themeColor="text1" w:themeTint="A6"/>
     </w:rPr>
   </w:style>
-  <w:style w:type="character" w:customStyle="1" w:styleId="Titre8Car">
-    <w:name w:val="Titre 8 Car"/>
-    <w:basedOn w:val="Policepardfaut"/>
-    <w:link w:val="Titre8"/>
+  <w:style w:type="character" w:customStyle="1" w:styleId="Heading8Char">
+    <w:name w:val="Heading 8 Char"/>
+    <w:basedOn w:val="DefaultParagraphFont"/>
+    <w:link w:val="Heading8"/>
     <w:uiPriority w:val="9"/>
     <w:semiHidden/>
     <w:rsid w:val="001417B5"/>
@@ -13835,10 +13988,10 @@
       <w:color w:val="272727" w:themeColor="text1" w:themeTint="D8"/>
     </w:rPr>
   </w:style>
-  <w:style w:type="character" w:customStyle="1" w:styleId="Titre9Car">
-    <w:name w:val="Titre 9 Car"/>
-    <w:basedOn w:val="Policepardfaut"/>
-    <w:link w:val="Titre9"/>
+  <w:style w:type="character" w:customStyle="1" w:styleId="Heading9Char">
+    <w:name w:val="Heading 9 Char"/>
+    <w:basedOn w:val="DefaultParagraphFont"/>
+    <w:link w:val="Heading9"/>
     <w:uiPriority w:val="9"/>
     <w:semiHidden/>
     <w:rsid w:val="001417B5"/>
@@ -13847,11 +14000,11 @@
       <w:color w:val="272727" w:themeColor="text1" w:themeTint="D8"/>
     </w:rPr>
   </w:style>
-  <w:style w:type="paragraph" w:styleId="Titre">
+  <w:style w:type="paragraph" w:styleId="Title">
     <w:name w:val="Title"/>
     <w:basedOn w:val="Normal"/>
     <w:next w:val="Normal"/>
-    <w:link w:val="TitreCar"/>
+    <w:link w:val="TitleChar"/>
     <w:uiPriority w:val="10"/>
     <w:qFormat/>
     <w:rsid w:val="001417B5"/>
@@ -13867,10 +14020,10 @@
       <w:szCs w:val="56"/>
     </w:rPr>
   </w:style>
-  <w:style w:type="character" w:customStyle="1" w:styleId="TitreCar">
-    <w:name w:val="Titre Car"/>
-    <w:basedOn w:val="Policepardfaut"/>
-    <w:link w:val="Titre"/>
+  <w:style w:type="character" w:customStyle="1" w:styleId="TitleChar">
+    <w:name w:val="Title Char"/>
+    <w:basedOn w:val="DefaultParagraphFont"/>
+    <w:link w:val="Title"/>
     <w:uiPriority w:val="10"/>
     <w:rsid w:val="001417B5"/>
     <w:rPr>
@@ -13881,11 +14034,11 @@
       <w:szCs w:val="56"/>
     </w:rPr>
   </w:style>
-  <w:style w:type="paragraph" w:styleId="Sous-titre">
+  <w:style w:type="paragraph" w:styleId="Subtitle">
     <w:name w:val="Subtitle"/>
     <w:basedOn w:val="Normal"/>
     <w:next w:val="Normal"/>
-    <w:link w:val="Sous-titreCar"/>
+    <w:link w:val="SubtitleChar"/>
     <w:uiPriority w:val="11"/>
     <w:qFormat/>
     <w:rsid w:val="001417B5"/>
@@ -13902,10 +14055,10 @@
       <w:szCs w:val="28"/>
     </w:rPr>
   </w:style>
-  <w:style w:type="character" w:customStyle="1" w:styleId="Sous-titreCar">
-    <w:name w:val="Sous-titre Car"/>
-    <w:basedOn w:val="Policepardfaut"/>
-    <w:link w:val="Sous-titre"/>
+  <w:style w:type="character" w:customStyle="1" w:styleId="SubtitleChar">
+    <w:name w:val="Subtitle Char"/>
+    <w:basedOn w:val="DefaultParagraphFont"/>
+    <w:link w:val="Subtitle"/>
     <w:uiPriority w:val="11"/>
     <w:rsid w:val="001417B5"/>
     <w:rPr>
@@ -13916,11 +14069,11 @@
       <w:szCs w:val="28"/>
     </w:rPr>
   </w:style>
-  <w:style w:type="paragraph" w:styleId="Citation">
+  <w:style w:type="paragraph" w:styleId="Quote">
     <w:name w:val="Quote"/>
     <w:basedOn w:val="Normal"/>
     <w:next w:val="Normal"/>
-    <w:link w:val="CitationCar"/>
+    <w:link w:val="QuoteChar"/>
     <w:uiPriority w:val="29"/>
     <w:qFormat/>
     <w:rsid w:val="001417B5"/>
@@ -13934,10 +14087,10 @@
       <w:color w:val="404040" w:themeColor="text1" w:themeTint="BF"/>
     </w:rPr>
   </w:style>
-  <w:style w:type="character" w:customStyle="1" w:styleId="CitationCar">
-    <w:name w:val="Citation Car"/>
-    <w:basedOn w:val="Policepardfaut"/>
-    <w:link w:val="Citation"/>
+  <w:style w:type="character" w:customStyle="1" w:styleId="QuoteChar">
+    <w:name w:val="Quote Char"/>
+    <w:basedOn w:val="DefaultParagraphFont"/>
+    <w:link w:val="Quote"/>
     <w:uiPriority w:val="29"/>
     <w:rsid w:val="001417B5"/>
     <w:rPr>
@@ -13946,7 +14099,7 @@
       <w:color w:val="404040" w:themeColor="text1" w:themeTint="BF"/>
     </w:rPr>
   </w:style>
-  <w:style w:type="paragraph" w:styleId="Paragraphedeliste">
+  <w:style w:type="paragraph" w:styleId="ListParagraph">
     <w:name w:val="List Paragraph"/>
     <w:basedOn w:val="Normal"/>
     <w:uiPriority w:val="34"/>
@@ -13957,9 +14110,9 @@
       <w:contextualSpacing/>
     </w:pPr>
   </w:style>
-  <w:style w:type="character" w:styleId="Accentuationintense">
+  <w:style w:type="character" w:styleId="IntenseEmphasis">
     <w:name w:val="Intense Emphasis"/>
-    <w:basedOn w:val="Policepardfaut"/>
+    <w:basedOn w:val="DefaultParagraphFont"/>
     <w:uiPriority w:val="21"/>
     <w:qFormat/>
     <w:rsid w:val="001417B5"/>
@@ -13969,11 +14122,11 @@
       <w:color w:val="0F4761" w:themeColor="accent1" w:themeShade="BF"/>
     </w:rPr>
   </w:style>
-  <w:style w:type="paragraph" w:styleId="Citationintense">
+  <w:style w:type="paragraph" w:styleId="IntenseQuote">
     <w:name w:val="Intense Quote"/>
     <w:basedOn w:val="Normal"/>
     <w:next w:val="Normal"/>
-    <w:link w:val="CitationintenseCar"/>
+    <w:link w:val="IntenseQuoteChar"/>
     <w:uiPriority w:val="30"/>
     <w:qFormat/>
     <w:rsid w:val="001417B5"/>
@@ -13992,10 +14145,10 @@
       <w:color w:val="0F4761" w:themeColor="accent1" w:themeShade="BF"/>
     </w:rPr>
   </w:style>
-  <w:style w:type="character" w:customStyle="1" w:styleId="CitationintenseCar">
-    <w:name w:val="Citation intense Car"/>
-    <w:basedOn w:val="Policepardfaut"/>
-    <w:link w:val="Citationintense"/>
+  <w:style w:type="character" w:customStyle="1" w:styleId="IntenseQuoteChar">
+    <w:name w:val="Intense Quote Char"/>
+    <w:basedOn w:val="DefaultParagraphFont"/>
+    <w:link w:val="IntenseQuote"/>
     <w:uiPriority w:val="30"/>
     <w:rsid w:val="001417B5"/>
     <w:rPr>
@@ -14004,9 +14157,9 @@
       <w:color w:val="0F4761" w:themeColor="accent1" w:themeShade="BF"/>
     </w:rPr>
   </w:style>
-  <w:style w:type="character" w:styleId="Rfrenceintense">
+  <w:style w:type="character" w:styleId="IntenseReference">
     <w:name w:val="Intense Reference"/>
-    <w:basedOn w:val="Policepardfaut"/>
+    <w:basedOn w:val="DefaultParagraphFont"/>
     <w:uiPriority w:val="32"/>
     <w:qFormat/>
     <w:rsid w:val="001417B5"/>
@@ -14018,9 +14171,9 @@
       <w:spacing w:val="5"/>
     </w:rPr>
   </w:style>
-  <w:style w:type="character" w:styleId="Lienhypertexte">
+  <w:style w:type="character" w:styleId="Hyperlink">
     <w:name w:val="Hyperlink"/>
-    <w:basedOn w:val="Policepardfaut"/>
+    <w:basedOn w:val="DefaultParagraphFont"/>
     <w:uiPriority w:val="99"/>
     <w:unhideWhenUsed/>
     <w:rsid w:val="005A3B47"/>
@@ -14029,9 +14182,9 @@
       <w:u w:val="single"/>
     </w:rPr>
   </w:style>
-  <w:style w:type="character" w:styleId="Mentionnonrsolue">
+  <w:style w:type="character" w:styleId="UnresolvedMention">
     <w:name w:val="Unresolved Mention"/>
-    <w:basedOn w:val="Policepardfaut"/>
+    <w:basedOn w:val="DefaultParagraphFont"/>
     <w:uiPriority w:val="99"/>
     <w:semiHidden/>
     <w:unhideWhenUsed/>

</xml_diff>